<commit_message>
spec(0019): the pinned privacy notice gains a vendor-side string; S18 decision row
Co-Authored-By: Claude Fable 5.1 <noreply@anthropic.com>
</commit_message>
<xml_diff>
--- a/0019_communications/0019_communications.docx
+++ b/0019_communications/0019_communications.docx
@@ -2,7 +2,7 @@
 <file path=word/document.xml><?xml version="1.0" encoding="utf-8"?>
 <w:document xmlns:w="http://schemas.openxmlformats.org/wordprocessingml/2006/main" xmlns:m="http://schemas.openxmlformats.org/officeDocument/2006/math" xmlns:r="http://schemas.openxmlformats.org/officeDocument/2006/relationships" xmlns:o="urn:schemas-microsoft-com:office:office" xmlns:v="urn:schemas-microsoft-com:vml" xmlns:w10="urn:schemas-microsoft-com:office:word" xmlns:a="http://schemas.openxmlformats.org/drawingml/2006/main" xmlns:pic="http://schemas.openxmlformats.org/drawingml/2006/picture" xmlns:wp="http://schemas.openxmlformats.org/drawingml/2006/wordprocessingDrawing">
   <w:body>
-    <w:bookmarkStart w:id="14" w:name="X8b968b136a73f5a4d4eb9d13dfa199f44bdf39a"/>
+    <w:bookmarkStart w:id="15" w:name="X8b968b136a73f5a4d4eb9d13dfa199f44bdf39a"/>
     <w:p>
       <w:pPr>
         <w:pStyle w:val="Heading1"/>
@@ -316,7 +316,136 @@
         <w:t xml:space="preserve">.</w:t>
       </w:r>
     </w:p>
+    <w:bookmarkStart w:id="14" w:name="Xe114c38ad039e84ca85da7fcbf3075ed71990e1"/>
+    <w:p>
+      <w:pPr>
+        <w:pStyle w:val="Heading2"/>
+      </w:pPr>
+      <w:r>
+        <w:t xml:space="preserve">§ Gate — pinned privacy notice, vendor-side string (2026-09-18)</w:t>
+      </w:r>
+    </w:p>
+    <w:p>
+      <w:pPr>
+        <w:pStyle w:val="FirstParagraph"/>
+      </w:pPr>
+      <w:r>
+        <w:t xml:space="preserve">The notice is pinned on BOTH sides (locked 2026-05-14). The EN canonical string above is addressed to the</w:t>
+      </w:r>
+      <w:r>
+        <w:t xml:space="preserve"> </w:t>
+      </w:r>
+      <w:r>
+        <w:t xml:space="preserve">couple; until 2026-09-18 the same sentence was pinned above the SUPPLIER’s conversation (</w:t>
+      </w:r>
+      <w:r>
+        <w:t xml:space="preserve">“your vendor sees</w:t>
+      </w:r>
+      <w:r>
+        <w:t xml:space="preserve"> </w:t>
+      </w:r>
+      <w:r>
+        <w:t xml:space="preserve">what they need from your profile”</w:t>
+      </w:r>
+      <w:r>
+        <w:t xml:space="preserve">). The supplier now reads a line addressed to the supplier — same lock, same</w:t>
+      </w:r>
+      <w:r>
+        <w:t xml:space="preserve"> </w:t>
+      </w:r>
+      <w:r>
+        <w:t xml:space="preserve">placement, same non-dismissibility, same list of items:</w:t>
+      </w:r>
+    </w:p>
+    <w:p>
+      <w:pPr>
+        <w:pStyle w:val="BlockText"/>
+      </w:pPr>
+      <w:r>
+        <w:rPr>
+          <w:i/>
+          <w:iCs/>
+        </w:rPr>
+        <w:t xml:space="preserve">“Everything you need for this event is already in Setnayan — their profile and this conversation carry it.</w:t>
+      </w:r>
+      <w:r>
+        <w:rPr>
+          <w:i/>
+          <w:iCs/>
+        </w:rPr>
+        <w:t xml:space="preserve"> </w:t>
+      </w:r>
+      <w:r>
+        <w:rPr>
+          <w:i/>
+          <w:iCs/>
+        </w:rPr>
+        <w:t xml:space="preserve">Never ask for private info in chat. government IDs · card numbers · full addresses · OTPs · passwords.</w:t>
+      </w:r>
+      <w:r>
+        <w:rPr>
+          <w:i/>
+          <w:iCs/>
+        </w:rPr>
+        <w:t xml:space="preserve"> </w:t>
+      </w:r>
+      <w:r>
+        <w:rPr>
+          <w:i/>
+          <w:iCs/>
+        </w:rPr>
+        <w:t xml:space="preserve">Couples are told to report a vendor who asks for these.”</w:t>
+      </w:r>
+    </w:p>
+    <w:p>
+      <w:pPr>
+        <w:pStyle w:val="FirstParagraph"/>
+      </w:pPr>
+      <w:r>
+        <w:t xml:space="preserve">The couple’s canonical string is unchanged, byte for byte (</w:t>
+      </w:r>
+      <w:r>
+        <w:rPr>
+          <w:rStyle w:val="VerbatimChar"/>
+        </w:rPr>
+        <w:t xml:space="preserve">apps/web/app/_components/chat-privacy-notice.tsx</w:t>
+      </w:r>
+      <w:r>
+        <w:t xml:space="preserve">,</w:t>
+      </w:r>
+      <w:r>
+        <w:t xml:space="preserve"> </w:t>
+      </w:r>
+      <w:r>
+        <w:rPr>
+          <w:rStyle w:val="VerbatimChar"/>
+        </w:rPr>
+        <w:t xml:space="preserve">viewer</w:t>
+      </w:r>
+      <w:r>
+        <w:t xml:space="preserve"> </w:t>
+      </w:r>
+      <w:r>
+        <w:t xml:space="preserve">prop;</w:t>
+      </w:r>
+      <w:r>
+        <w:t xml:space="preserve"> </w:t>
+      </w:r>
+      <w:r>
+        <w:rPr>
+          <w:rStyle w:val="VerbatimChar"/>
+        </w:rPr>
+        <w:t xml:space="preserve">lib/one-chat-box-everywhere.test.ts</w:t>
+      </w:r>
+      <w:r>
+        <w:t xml:space="preserve"> </w:t>
+      </w:r>
+      <w:r>
+        <w:t xml:space="preserve">asserts both).</w:t>
+      </w:r>
+    </w:p>
     <w:bookmarkEnd w:id="14"/>
+    <w:bookmarkEnd w:id="15"/>
     <w:sectPr>
       <w:footnotePr>
         <w:numRestart w:val="eachSect"/>

</xml_diff>